<commit_message>
feat: onboarding com verificacao UTFPR, termo com instituicao e cidade, e vice-presidencia na hierarquia
</commit_message>
<xml_diff>
--- a/templates/termo_voluntariado.docx
+++ b/templates/termo_voluntariado.docx
@@ -1447,7 +1447,7 @@
               </w:rPr>
               <w:t>UTFPR:</w:t>
               <w:tab/>
-              <w:t>(x)</w:t>
+              <w:t>{utfpr_sim}</w:t>
             </w:r>
             <w:r>
               <w:rPr>
@@ -1470,7 +1470,7 @@
               </w:rPr>
               <w:t>sim</w:t>
               <w:tab/>
-              <w:t>( )</w:t>
+              <w:t>{utfpr_nao}</w:t>
             </w:r>
             <w:r>
               <w:rPr>
@@ -1492,6 +1492,59 @@
                 <w:lang w:eastAsia="en-US" w:bidi="ar-SA"/>
               </w:rPr>
               <w:t>não</w:t>
+            </w:r>
+          </w:p>
+        </w:tc>
+      </w:tr>
+      <w:tr>
+        <w:trPr>
+          <w:trHeight w:val="254" w:hRule="atLeast"/>
+        </w:trPr>
+        <w:tc>
+          <w:tcPr>
+            <w:tcW w:w="9547" w:type="dxa"/>
+            <w:gridSpan w:val="6"/>
+            <w:tcBorders>
+              <w:top w:val="single" w:sz="4" w:space="0" w:color="000000"/>
+              <w:left w:val="single" w:sz="4" w:space="0" w:color="000000"/>
+              <w:bottom w:val="single" w:sz="4" w:space="0" w:color="000000"/>
+              <w:right w:val="single" w:sz="4" w:space="0" w:color="000000"/>
+            </w:tcBorders>
+          </w:tcPr>
+          <w:p>
+            <w:pPr>
+              <w:pStyle w:val="TableParagraph"/>
+              <w:widowControl w:val="false"/>
+              <w:spacing w:lineRule="exact" w:line="234" w:before="0" w:after="0"/>
+              <w:ind w:left="105"/>
+              <w:jc w:val="left"/>
+              <w:rPr>
+                <w:color w:val="000000"/>
+                <w:kern w:val="0"/>
+                <w:sz w:val="22"/>
+                <w:szCs w:val="22"/>
+                <w:lang w:eastAsia="en-US" w:bidi="ar-SA"/>
+              </w:rPr>
+            </w:pPr>
+            <w:r>
+              <w:rPr>
+                <w:color w:val="000000"/>
+                <w:kern w:val="0"/>
+                <w:sz w:val="22"/>
+                <w:szCs w:val="22"/>
+                <w:lang w:eastAsia="en-US" w:bidi="ar-SA"/>
+              </w:rPr>
+              <w:t xml:space="preserve">Instituição: </w:t>
+            </w:r>
+            <w:r>
+              <w:rPr>
+                <w:color w:val="000000"/>
+                <w:kern w:val="0"/>
+                <w:sz w:val="22"/>
+                <w:szCs w:val="22"/>
+                <w:lang w:eastAsia="en-US" w:bidi="ar-SA"/>
+              </w:rPr>
+              <w:t>{instituicao}</w:t>
             </w:r>
           </w:p>
         </w:tc>
@@ -6921,7 +6974,16 @@
                 <w:szCs w:val="22"/>
                 <w:lang w:eastAsia="en-US" w:bidi="ar-SA"/>
               </w:rPr>
-              <w:t>Local: Cornélio Procópio</w:t>
+              <w:t xml:space="preserve">Local: </w:t>
+            </w:r>
+            <w:r>
+              <w:rPr>
+                <w:kern w:val="0"/>
+                <w:sz w:val="22"/>
+                <w:szCs w:val="22"/>
+                <w:lang w:eastAsia="en-US" w:bidi="ar-SA"/>
+              </w:rPr>
+              <w:t>{cidade}</w:t>
             </w:r>
           </w:p>
         </w:tc>

</xml_diff>